<commit_message>
docs: convert all mathematical equations in RESEARCH_PAPER 2.docx into native LaTeX Office Math (OMML) and generate RESEARCH_PAPER 3.docx
</commit_message>
<xml_diff>
--- a/RESEARCH_PAPER 2.docx
+++ b/RESEARCH_PAPER 2.docx
@@ -245,14 +245,47 @@
         <w:spacing w:before="80" w:after="120"/>
         <w:jc w:val="center"/>
       </w:pPr>
-      <w:r>
-        <w:rPr>
-          <w:rFonts w:ascii="Cambria Math" w:hAnsi="Cambria Math"/>
-          <w:i/>
-          <w:sz w:val="20"/>
-        </w:rPr>
-        <w:t>Q = (IME / L) · U_eff</w:t>
-      </w:r>
+      <m:oMath>
+        <m:r>
+          <m:t>Q=</m:t>
+        </m:r>
+        <m:f>
+          <m:fPr>
+            <m:type m:val="bar"/>
+          </m:fPr>
+          <m:num>
+            <m:r>
+              <m:rPr>
+                <m:nor/>
+              </m:rPr>
+              <m:t>IME</m:t>
+            </m:r>
+          </m:num>
+          <m:den>
+            <m:r>
+              <m:t>L</m:t>
+            </m:r>
+          </m:den>
+        </m:f>
+        <m:r>
+          <m:t>·</m:t>
+        </m:r>
+        <m:sSub>
+          <m:e>
+            <m:r>
+              <m:t>U</m:t>
+            </m:r>
+          </m:e>
+          <m:sub>
+            <m:r>
+              <m:rPr>
+                <m:nor/>
+              </m:rPr>
+              <m:t>eff</m:t>
+            </m:r>
+          </m:sub>
+        </m:sSub>
+      </m:oMath>
       <w:r>
         <w:rPr>
           <w:rFonts w:ascii="Times New Roman" w:hAnsi="Times New Roman"/>
@@ -1349,14 +1382,189 @@
         <w:spacing w:before="80" w:after="120"/>
         <w:jc w:val="center"/>
       </w:pPr>
-      <w:r>
-        <w:rPr>
-          <w:rFonts w:ascii="Cambria Math" w:hAnsi="Cambria Math"/>
-          <w:i/>
-          <w:sz w:val="20"/>
-        </w:rPr>
-        <w:t>x̂_t = x_t1 + [(t - t1)/(t2 - t1)] · (x_t2 - x_t1), ∀ t ∈ (t1, t2)</w:t>
-      </w:r>
+      <m:oMath>
+        <m:sSub>
+          <m:e>
+            <m:acc>
+              <m:accPr>
+                <m:chr m:val="̂"/>
+              </m:accPr>
+              <m:e>
+                <m:r>
+                  <m:t>x</m:t>
+                </m:r>
+              </m:e>
+            </m:acc>
+          </m:e>
+          <m:sub>
+            <m:r>
+              <m:t>t</m:t>
+            </m:r>
+          </m:sub>
+        </m:sSub>
+        <m:r>
+          <m:t>=</m:t>
+        </m:r>
+        <m:sSub>
+          <m:e>
+            <m:r>
+              <m:t>x</m:t>
+            </m:r>
+          </m:e>
+          <m:sub>
+            <m:sSub>
+              <m:e>
+                <m:r>
+                  <m:t>t</m:t>
+                </m:r>
+              </m:e>
+              <m:sub>
+                <m:r>
+                  <m:t>1</m:t>
+                </m:r>
+              </m:sub>
+            </m:sSub>
+          </m:sub>
+        </m:sSub>
+        <m:r>
+          <m:t>+</m:t>
+        </m:r>
+        <m:f>
+          <m:fPr>
+            <m:type m:val="bar"/>
+          </m:fPr>
+          <m:num>
+            <m:r>
+              <m:t>t−</m:t>
+            </m:r>
+            <m:sSub>
+              <m:e>
+                <m:r>
+                  <m:t>t</m:t>
+                </m:r>
+              </m:e>
+              <m:sub>
+                <m:r>
+                  <m:t>1</m:t>
+                </m:r>
+              </m:sub>
+            </m:sSub>
+          </m:num>
+          <m:den>
+            <m:sSub>
+              <m:e>
+                <m:r>
+                  <m:t>t</m:t>
+                </m:r>
+              </m:e>
+              <m:sub>
+                <m:r>
+                  <m:t>2</m:t>
+                </m:r>
+              </m:sub>
+            </m:sSub>
+            <m:r>
+              <m:t>−</m:t>
+            </m:r>
+            <m:sSub>
+              <m:e>
+                <m:r>
+                  <m:t>t</m:t>
+                </m:r>
+              </m:e>
+              <m:sub>
+                <m:r>
+                  <m:t>1</m:t>
+                </m:r>
+              </m:sub>
+            </m:sSub>
+          </m:den>
+        </m:f>
+        <m:r>
+          <m:t>(</m:t>
+        </m:r>
+        <m:sSub>
+          <m:e>
+            <m:r>
+              <m:t>x</m:t>
+            </m:r>
+          </m:e>
+          <m:sub>
+            <m:sSub>
+              <m:e>
+                <m:r>
+                  <m:t>t</m:t>
+                </m:r>
+              </m:e>
+              <m:sub>
+                <m:r>
+                  <m:t>2</m:t>
+                </m:r>
+              </m:sub>
+            </m:sSub>
+          </m:sub>
+        </m:sSub>
+        <m:r>
+          <m:t>−</m:t>
+        </m:r>
+        <m:sSub>
+          <m:e>
+            <m:r>
+              <m:t>x</m:t>
+            </m:r>
+          </m:e>
+          <m:sub>
+            <m:sSub>
+              <m:e>
+                <m:r>
+                  <m:t>t</m:t>
+                </m:r>
+              </m:e>
+              <m:sub>
+                <m:r>
+                  <m:t>1</m:t>
+                </m:r>
+              </m:sub>
+            </m:sSub>
+          </m:sub>
+        </m:sSub>
+        <m:r>
+          <m:t>),</m:t>
+        </m:r>
+        <m:r>
+          <m:t>∀t∈(</m:t>
+        </m:r>
+        <m:sSub>
+          <m:e>
+            <m:r>
+              <m:t>t</m:t>
+            </m:r>
+          </m:e>
+          <m:sub>
+            <m:r>
+              <m:t>1</m:t>
+            </m:r>
+          </m:sub>
+        </m:sSub>
+        <m:r>
+          <m:t>,</m:t>
+        </m:r>
+        <m:sSub>
+          <m:e>
+            <m:r>
+              <m:t>t</m:t>
+            </m:r>
+          </m:e>
+          <m:sub>
+            <m:r>
+              <m:t>2</m:t>
+            </m:r>
+          </m:sub>
+        </m:sSub>
+        <m:r>
+          <m:t>)</m:t>
+        </m:r>
+      </m:oMath>
       <w:r>
         <w:rPr>
           <w:rFonts w:ascii="Times New Roman" w:hAnsi="Times New Roman"/>
@@ -1425,14 +1633,103 @@
         <w:spacing w:before="80" w:after="120"/>
         <w:jc w:val="center"/>
       </w:pPr>
-      <w:r>
-        <w:rPr>
-          <w:rFonts w:ascii="Cambria Math" w:hAnsi="Cambria Math"/>
-          <w:i/>
-          <w:sz w:val="20"/>
-        </w:rPr>
-        <w:t>u = -WS · sin(π · WD / 180),  v = -WS · cos(π · WD / 180)</w:t>
-      </w:r>
+      <m:oMath>
+        <m:r>
+          <m:t>u=−</m:t>
+        </m:r>
+        <m:r>
+          <m:rPr>
+            <m:nor/>
+          </m:rPr>
+          <m:t>WS</m:t>
+        </m:r>
+        <m:r>
+          <m:t>·</m:t>
+        </m:r>
+        <m:r>
+          <m:rPr>
+            <m:sty m:val="p"/>
+          </m:rPr>
+          <m:t>sin</m:t>
+        </m:r>
+        <m:d>
+          <m:dPr>
+            <m:sepChr m:val=""/>
+          </m:dPr>
+          <m:e>
+            <m:f>
+              <m:fPr>
+                <m:type m:val="bar"/>
+              </m:fPr>
+              <m:num>
+                <m:r>
+                  <m:t>π·</m:t>
+                </m:r>
+                <m:r>
+                  <m:rPr>
+                    <m:nor/>
+                  </m:rPr>
+                  <m:t>WD</m:t>
+                </m:r>
+              </m:num>
+              <m:den>
+                <m:r>
+                  <m:t>180</m:t>
+                </m:r>
+              </m:den>
+            </m:f>
+          </m:e>
+        </m:d>
+        <m:r>
+          <m:t>,</m:t>
+        </m:r>
+        <m:r>
+          <m:t>v=−</m:t>
+        </m:r>
+        <m:r>
+          <m:rPr>
+            <m:nor/>
+          </m:rPr>
+          <m:t>WS</m:t>
+        </m:r>
+        <m:r>
+          <m:t>·</m:t>
+        </m:r>
+        <m:r>
+          <m:rPr>
+            <m:sty m:val="p"/>
+          </m:rPr>
+          <m:t>cos</m:t>
+        </m:r>
+        <m:d>
+          <m:dPr>
+            <m:sepChr m:val=""/>
+          </m:dPr>
+          <m:e>
+            <m:f>
+              <m:fPr>
+                <m:type m:val="bar"/>
+              </m:fPr>
+              <m:num>
+                <m:r>
+                  <m:t>π·</m:t>
+                </m:r>
+                <m:r>
+                  <m:rPr>
+                    <m:nor/>
+                  </m:rPr>
+                  <m:t>WD</m:t>
+                </m:r>
+              </m:num>
+              <m:den>
+                <m:r>
+                  <m:t>180</m:t>
+                </m:r>
+              </m:den>
+            </m:f>
+          </m:e>
+        </m:d>
+      </m:oMath>
       <w:r>
         <w:rPr>
           <w:rFonts w:ascii="Times New Roman" w:hAnsi="Times New Roman"/>
@@ -1475,14 +1772,90 @@
         <w:spacing w:before="80" w:after="120"/>
         <w:jc w:val="center"/>
       </w:pPr>
-      <w:r>
-        <w:rPr>
-          <w:rFonts w:ascii="Cambria Math" w:hAnsi="Cambria Math"/>
-          <w:i/>
-          <w:sz w:val="20"/>
-        </w:rPr>
-        <w:t>Δθ = min(|WD - 130.0°|, 360.0° - |WD - 130.0°|)</w:t>
-      </w:r>
+      <m:oMath>
+        <m:r>
+          <m:t>Δθ=min</m:t>
+        </m:r>
+        <m:d>
+          <m:dPr>
+            <m:sepChr m:val=""/>
+          </m:dPr>
+          <m:e>
+            <m:r>
+              <m:t>|</m:t>
+            </m:r>
+            <m:r>
+              <m:rPr>
+                <m:nor/>
+              </m:rPr>
+              <m:t>WD</m:t>
+            </m:r>
+            <m:r>
+              <m:t>−</m:t>
+            </m:r>
+            <m:sSup>
+              <m:e>
+                <m:r>
+                  <m:t>130.0</m:t>
+                </m:r>
+              </m:e>
+              <m:sup>
+                <m:r>
+                  <m:t>∘</m:t>
+                </m:r>
+              </m:sup>
+            </m:sSup>
+            <m:r>
+              <m:t>|</m:t>
+            </m:r>
+            <m:r>
+              <m:t>,</m:t>
+            </m:r>
+            <m:sSup>
+              <m:e>
+                <m:r>
+                  <m:t>360.0</m:t>
+                </m:r>
+              </m:e>
+              <m:sup>
+                <m:r>
+                  <m:t>∘</m:t>
+                </m:r>
+              </m:sup>
+            </m:sSup>
+            <m:r>
+              <m:t>−</m:t>
+            </m:r>
+            <m:r>
+              <m:t>|</m:t>
+            </m:r>
+            <m:r>
+              <m:rPr>
+                <m:nor/>
+              </m:rPr>
+              <m:t>WD</m:t>
+            </m:r>
+            <m:r>
+              <m:t>−</m:t>
+            </m:r>
+            <m:sSup>
+              <m:e>
+                <m:r>
+                  <m:t>130.0</m:t>
+                </m:r>
+              </m:e>
+              <m:sup>
+                <m:r>
+                  <m:t>∘</m:t>
+                </m:r>
+              </m:sup>
+            </m:sSup>
+            <m:r>
+              <m:t>|</m:t>
+            </m:r>
+          </m:e>
+        </m:d>
+      </m:oMath>
       <w:r>
         <w:rPr>
           <w:rFonts w:ascii="Times New Roman" w:hAnsi="Times New Roman"/>
@@ -1511,14 +1884,57 @@
         <w:spacing w:before="80" w:after="120"/>
         <w:jc w:val="center"/>
       </w:pPr>
-      <w:r>
-        <w:rPr>
-          <w:rFonts w:ascii="Cambria Math" w:hAnsi="Cambria Math"/>
-          <w:i/>
-          <w:sz w:val="20"/>
-        </w:rPr>
-        <w:t>Alignment Index = max(0, cos(π · Δθ / 180))</w:t>
-      </w:r>
+      <m:oMath>
+        <m:r>
+          <m:rPr>
+            <m:nor/>
+          </m:rPr>
+          <m:t>Alignment Index</m:t>
+        </m:r>
+        <m:r>
+          <m:t>=max</m:t>
+        </m:r>
+        <m:d>
+          <m:dPr>
+            <m:sepChr m:val=","/>
+          </m:dPr>
+          <m:e>
+            <m:r>
+              <m:t>0</m:t>
+            </m:r>
+          </m:e>
+          <m:e>
+            <m:r>
+              <m:rPr>
+                <m:sty m:val="p"/>
+              </m:rPr>
+              <m:t>cos</m:t>
+            </m:r>
+            <m:d>
+              <m:dPr>
+                <m:sepChr m:val=""/>
+              </m:dPr>
+              <m:e>
+                <m:f>
+                  <m:fPr>
+                    <m:type m:val="bar"/>
+                  </m:fPr>
+                  <m:num>
+                    <m:r>
+                      <m:t>π·Δθ</m:t>
+                    </m:r>
+                  </m:num>
+                  <m:den>
+                    <m:r>
+                      <m:t>180</m:t>
+                    </m:r>
+                  </m:den>
+                </m:f>
+              </m:e>
+            </m:d>
+          </m:e>
+        </m:d>
+      </m:oMath>
       <w:r>
         <w:rPr>
           <w:rFonts w:ascii="Times New Roman" w:hAnsi="Times New Roman"/>
@@ -1561,14 +1977,44 @@
         <w:spacing w:before="80" w:after="120"/>
         <w:jc w:val="center"/>
       </w:pPr>
-      <w:r>
-        <w:rPr>
-          <w:rFonts w:ascii="Cambria Math" w:hAnsi="Cambria Math"/>
-          <w:i/>
-          <w:sz w:val="20"/>
-        </w:rPr>
-        <w:t>Dispersion Index = Alignment Index · exp(-0.25 · WS)</w:t>
-      </w:r>
+      <m:oMath>
+        <m:r>
+          <m:rPr>
+            <m:nor/>
+          </m:rPr>
+          <m:t>Dispersion Index</m:t>
+        </m:r>
+        <m:r>
+          <m:t>=</m:t>
+        </m:r>
+        <m:r>
+          <m:rPr>
+            <m:nor/>
+          </m:rPr>
+          <m:t>Alignment Index</m:t>
+        </m:r>
+        <m:r>
+          <m:t>·</m:t>
+        </m:r>
+        <m:r>
+          <m:rPr>
+            <m:sty m:val="p"/>
+          </m:rPr>
+          <m:t>exp</m:t>
+        </m:r>
+        <m:r>
+          <m:t>(−0.25·</m:t>
+        </m:r>
+        <m:r>
+          <m:rPr>
+            <m:nor/>
+          </m:rPr>
+          <m:t>WS</m:t>
+        </m:r>
+        <m:r>
+          <m:t>)</m:t>
+        </m:r>
+      </m:oMath>
       <w:r>
         <w:rPr>
           <w:rFonts w:ascii="Times New Roman" w:hAnsi="Times New Roman"/>
@@ -1611,14 +2057,71 @@
         <w:spacing w:before="80" w:after="120"/>
         <w:jc w:val="center"/>
       </w:pPr>
-      <w:r>
-        <w:rPr>
-          <w:rFonts w:ascii="Cambria Math" w:hAnsi="Cambria Math"/>
-          <w:i/>
-          <w:sz w:val="20"/>
-        </w:rPr>
-        <w:t>Ventilation Index Proxy = [WS · (T_ambient + 273.15)] / (P_barometric + ε)</w:t>
-      </w:r>
+      <m:oMath>
+        <m:r>
+          <m:rPr>
+            <m:nor/>
+          </m:rPr>
+          <m:t>Ventilation Index Proxy</m:t>
+        </m:r>
+        <m:r>
+          <m:t>=</m:t>
+        </m:r>
+        <m:f>
+          <m:fPr>
+            <m:type m:val="bar"/>
+          </m:fPr>
+          <m:num>
+            <m:r>
+              <m:rPr>
+                <m:nor/>
+              </m:rPr>
+              <m:t>WS</m:t>
+            </m:r>
+            <m:r>
+              <m:t>·(</m:t>
+            </m:r>
+            <m:sSub>
+              <m:e>
+                <m:r>
+                  <m:t>T</m:t>
+                </m:r>
+              </m:e>
+              <m:sub>
+                <m:r>
+                  <m:rPr>
+                    <m:nor/>
+                  </m:rPr>
+                  <m:t>ambient</m:t>
+                </m:r>
+              </m:sub>
+            </m:sSub>
+            <m:r>
+              <m:t>+273.15)</m:t>
+            </m:r>
+          </m:num>
+          <m:den>
+            <m:sSub>
+              <m:e>
+                <m:r>
+                  <m:t>P</m:t>
+                </m:r>
+              </m:e>
+              <m:sub>
+                <m:r>
+                  <m:rPr>
+                    <m:nor/>
+                  </m:rPr>
+                  <m:t>barometric</m:t>
+                </m:r>
+              </m:sub>
+            </m:sSub>
+            <m:r>
+              <m:t>+ϵ</m:t>
+            </m:r>
+          </m:den>
+        </m:f>
+      </m:oMath>
       <w:r>
         <w:rPr>
           <w:rFonts w:ascii="Times New Roman" w:hAnsi="Times New Roman"/>
@@ -1748,14 +2251,88 @@
         <w:spacing w:before="80" w:after="120"/>
         <w:jc w:val="center"/>
       </w:pPr>
-      <w:r>
-        <w:rPr>
-          <w:rFonts w:ascii="Cambria Math" w:hAnsi="Cambria Math"/>
-          <w:i/>
-          <w:sz w:val="20"/>
-        </w:rPr>
-        <w:t>φ_i(f, x) = ∑ [|S|!(|F| - |S| - 1)! / |F|!] · [f_x(S ∪ {i}) - f_x(S)]</w:t>
-      </w:r>
+      <m:oMath>
+        <m:sSub>
+          <m:e>
+            <m:r>
+              <m:t>ϕ</m:t>
+            </m:r>
+          </m:e>
+          <m:sub>
+            <m:r>
+              <m:t>i</m:t>
+            </m:r>
+          </m:sub>
+        </m:sSub>
+        <m:r>
+          <m:t>(f,x)=</m:t>
+        </m:r>
+        <m:nary>
+          <m:naryPr>
+            <m:chr m:val="∑"/>
+            <m:limLoc m:val="subSup"/>
+            <m:grow m:val="1"/>
+            <m:subHide m:val="off"/>
+            <m:supHide m:val="on"/>
+          </m:naryPr>
+          <m:sub>
+            <m:r>
+              <m:t>S⊆F⧵{i}</m:t>
+            </m:r>
+          </m:sub>
+          <m:sup/>
+          <m:e>
+            <m:f>
+              <m:fPr>
+                <m:type m:val="bar"/>
+              </m:fPr>
+              <m:num>
+                <m:r>
+                  <m:t>|S|!(|F|−|S|−1)!</m:t>
+                </m:r>
+              </m:num>
+              <m:den>
+                <m:r>
+                  <m:t>|F|!</m:t>
+                </m:r>
+              </m:den>
+            </m:f>
+          </m:e>
+        </m:nary>
+        <m:r>
+          <m:t>[</m:t>
+        </m:r>
+        <m:sSub>
+          <m:e>
+            <m:r>
+              <m:t>f</m:t>
+            </m:r>
+          </m:e>
+          <m:sub>
+            <m:r>
+              <m:t>x</m:t>
+            </m:r>
+          </m:sub>
+        </m:sSub>
+        <m:r>
+          <m:t>(S∪{i})−</m:t>
+        </m:r>
+        <m:sSub>
+          <m:e>
+            <m:r>
+              <m:t>f</m:t>
+            </m:r>
+          </m:e>
+          <m:sub>
+            <m:r>
+              <m:t>x</m:t>
+            </m:r>
+          </m:sub>
+        </m:sSub>
+        <m:r>
+          <m:t>(S)]</m:t>
+        </m:r>
+      </m:oMath>
       <w:r>
         <w:rPr>
           <w:rFonts w:ascii="Times New Roman" w:hAnsi="Times New Roman"/>
@@ -1784,14 +2361,71 @@
         <w:spacing w:before="80" w:after="120"/>
         <w:jc w:val="center"/>
       </w:pPr>
-      <w:r>
-        <w:rPr>
-          <w:rFonts w:ascii="Cambria Math" w:hAnsi="Cambria Math"/>
-          <w:i/>
-          <w:sz w:val="20"/>
-        </w:rPr>
-        <w:t>f(x) = φ_0(f) + ∑ φ_i(f, x)</w:t>
-      </w:r>
+      <m:oMath>
+        <m:r>
+          <m:t>f(x)=</m:t>
+        </m:r>
+        <m:sSub>
+          <m:e>
+            <m:r>
+              <m:t>ϕ</m:t>
+            </m:r>
+          </m:e>
+          <m:sub>
+            <m:r>
+              <m:t>0</m:t>
+            </m:r>
+          </m:sub>
+        </m:sSub>
+        <m:r>
+          <m:t>(f)+</m:t>
+        </m:r>
+        <m:nary>
+          <m:naryPr>
+            <m:chr m:val="∑"/>
+            <m:limLoc m:val="subSup"/>
+            <m:grow m:val="1"/>
+            <m:subHide m:val="off"/>
+            <m:supHide m:val="off"/>
+          </m:naryPr>
+          <m:sub>
+            <m:r>
+              <m:t>i=1</m:t>
+            </m:r>
+          </m:sub>
+          <m:sup>
+            <m:d>
+              <m:dPr>
+                <m:begChr m:val="|"/>
+                <m:sepChr m:val=""/>
+                <m:endChr m:val="|"/>
+              </m:dPr>
+              <m:e>
+                <m:r>
+                  <m:t>F</m:t>
+                </m:r>
+              </m:e>
+            </m:d>
+          </m:sup>
+          <m:e>
+            <m:sSub>
+              <m:e>
+                <m:r>
+                  <m:t>ϕ</m:t>
+                </m:r>
+              </m:e>
+              <m:sub>
+                <m:r>
+                  <m:t>i</m:t>
+                </m:r>
+              </m:sub>
+            </m:sSub>
+          </m:e>
+        </m:nary>
+        <m:r>
+          <m:t>(f,x)</m:t>
+        </m:r>
+      </m:oMath>
       <w:r>
         <w:rPr>
           <w:rFonts w:ascii="Times New Roman" w:hAnsi="Times New Roman"/>

</xml_diff>